<commit_message>
Eval: A1/A6 on all 50 papers (laptop run); paper and report updated
- eval/results/ablations.md from the laptop run: parser A1 on 50 PDFs
  (gold values in text: GROBID 83%, PyMuPDF 90%; hyperparameters 67% vs 81%)
  and retrieval A6 with dense and hybrid (recall@5 45% / 36% / 45%).
- run_eval keeps the last A1/A6 sections when run without --pdf-dir.
- Paper: A1 figure redrawn from ablations.md, A6 table, parsing-ceiling numbers;
  REPORT.md/.docx and CLAUDE.md likewise.

Co-Authored-By: Claude Opus 5.5 <noreply@anthropic.com>
Claude-Session: https://claude.ai/code/session_01BoeUNvQjUV4rg3bqYVg261
</commit_message>
<xml_diff>
--- a/docs/REPORT.docx
+++ b/docs/REPORT.docx
@@ -5888,13 +5888,7 @@
         <w:t xml:space="preserve"> </w:t>
       </w:r>
       <w:r>
-        <w:t xml:space="preserve">(the 10 reference PDFs; the new papers’ PDFs stayed on the laptop, so A1 and</w:t>
-      </w:r>
-      <w:r>
-        <w:t xml:space="preserve"> </w:t>
-      </w:r>
-      <w:r>
-        <w:t xml:space="preserve">A6 on all 50 are run there with</w:t>
+        <w:t xml:space="preserve">(all 50 papers, run on the laptop with</w:t>
       </w:r>
       <w:r>
         <w:t xml:space="preserve"> </w:t>
@@ -5903,7 +5897,7 @@
         <w:rPr>
           <w:rStyle w:val="VerbatimChar"/>
         </w:rPr>
-        <w:t xml:space="preserve">run_eval --pdf-dir</w:t>
+        <w:t xml:space="preserve">--pdf-dir --tei-dir</w:t>
       </w:r>
       <w:r>
         <w:t xml:space="preserve">):</w:t>
@@ -6022,55 +6016,55 @@
               <w:jc w:val="left"/>
             </w:pPr>
             <w:r>
-              <w:t xml:space="preserve">260</w:t>
-            </w:r>
-          </w:p>
-        </w:tc>
-        <w:tc>
-          <w:tcPr/>
-          <w:p>
-            <w:pPr>
-              <w:pStyle w:val="Compact"/>
-              <w:jc w:val="left"/>
-            </w:pPr>
-            <w:r>
-              <w:t xml:space="preserve">66 / 74</w:t>
-            </w:r>
-          </w:p>
-        </w:tc>
-        <w:tc>
-          <w:tcPr/>
-          <w:p>
-            <w:pPr>
-              <w:pStyle w:val="Compact"/>
-              <w:jc w:val="left"/>
-            </w:pPr>
-            <w:r>
-              <w:t xml:space="preserve">463</w:t>
-            </w:r>
-          </w:p>
-        </w:tc>
-        <w:tc>
-          <w:tcPr/>
-          <w:p>
-            <w:pPr>
-              <w:pStyle w:val="Compact"/>
-              <w:jc w:val="left"/>
-            </w:pPr>
-            <w:r>
-              <w:t xml:space="preserve">67</w:t>
-            </w:r>
-          </w:p>
-        </w:tc>
-        <w:tc>
-          <w:tcPr/>
-          <w:p>
-            <w:pPr>
-              <w:pStyle w:val="Compact"/>
-              <w:jc w:val="left"/>
-            </w:pPr>
-            <w:r>
-              <w:t xml:space="preserve">89%</w:t>
+              <w:t xml:space="preserve">1,520</w:t>
+            </w:r>
+          </w:p>
+        </w:tc>
+        <w:tc>
+          <w:tcPr/>
+          <w:p>
+            <w:pPr>
+              <w:pStyle w:val="Compact"/>
+              <w:jc w:val="left"/>
+            </w:pPr>
+            <w:r>
+              <w:t xml:space="preserve">321 / 436</w:t>
+            </w:r>
+          </w:p>
+        </w:tc>
+        <w:tc>
+          <w:tcPr/>
+          <w:p>
+            <w:pPr>
+              <w:pStyle w:val="Compact"/>
+              <w:jc w:val="left"/>
+            </w:pPr>
+            <w:r>
+              <w:t xml:space="preserve">3,026</w:t>
+            </w:r>
+          </w:p>
+        </w:tc>
+        <w:tc>
+          <w:tcPr/>
+          <w:p>
+            <w:pPr>
+              <w:pStyle w:val="Compact"/>
+              <w:jc w:val="left"/>
+            </w:pPr>
+            <w:r>
+              <w:t xml:space="preserve">580</w:t>
+            </w:r>
+          </w:p>
+        </w:tc>
+        <w:tc>
+          <w:tcPr/>
+          <w:p>
+            <w:pPr>
+              <w:pStyle w:val="Compact"/>
+              <w:jc w:val="left"/>
+            </w:pPr>
+            <w:r>
+              <w:t xml:space="preserve">83%</w:t>
             </w:r>
           </w:p>
         </w:tc>
@@ -6096,55 +6090,55 @@
               <w:jc w:val="left"/>
             </w:pPr>
             <w:r>
-              <w:t xml:space="preserve">181</w:t>
-            </w:r>
-          </w:p>
-        </w:tc>
-        <w:tc>
-          <w:tcPr/>
-          <w:p>
-            <w:pPr>
-              <w:pStyle w:val="Compact"/>
-              <w:jc w:val="left"/>
-            </w:pPr>
-            <w:r>
-              <w:t xml:space="preserve">74 / 74</w:t>
-            </w:r>
-          </w:p>
-        </w:tc>
-        <w:tc>
-          <w:tcPr/>
-          <w:p>
-            <w:pPr>
-              <w:pStyle w:val="Compact"/>
-              <w:jc w:val="left"/>
-            </w:pPr>
-            <w:r>
-              <w:t xml:space="preserve">344</w:t>
-            </w:r>
-          </w:p>
-        </w:tc>
-        <w:tc>
-          <w:tcPr/>
-          <w:p>
-            <w:pPr>
-              <w:pStyle w:val="Compact"/>
-              <w:jc w:val="left"/>
-            </w:pPr>
-            <w:r>
-              <w:t xml:space="preserve">30</w:t>
-            </w:r>
-          </w:p>
-        </w:tc>
-        <w:tc>
-          <w:tcPr/>
-          <w:p>
-            <w:pPr>
-              <w:pStyle w:val="Compact"/>
-              <w:jc w:val="left"/>
-            </w:pPr>
-            <w:r>
-              <w:t xml:space="preserve">93%</w:t>
+              <w:t xml:space="preserve">1,165</w:t>
+            </w:r>
+          </w:p>
+        </w:tc>
+        <w:tc>
+          <w:tcPr/>
+          <w:p>
+            <w:pPr>
+              <w:pStyle w:val="Compact"/>
+              <w:jc w:val="left"/>
+            </w:pPr>
+            <w:r>
+              <w:t xml:space="preserve">344 / 344</w:t>
+            </w:r>
+          </w:p>
+        </w:tc>
+        <w:tc>
+          <w:tcPr/>
+          <w:p>
+            <w:pPr>
+              <w:pStyle w:val="Compact"/>
+              <w:jc w:val="left"/>
+            </w:pPr>
+            <w:r>
+              <w:t xml:space="preserve">2,394</w:t>
+            </w:r>
+          </w:p>
+        </w:tc>
+        <w:tc>
+          <w:tcPr/>
+          <w:p>
+            <w:pPr>
+              <w:pStyle w:val="Compact"/>
+              <w:jc w:val="left"/>
+            </w:pPr>
+            <w:r>
+              <w:t xml:space="preserve">243</w:t>
+            </w:r>
+          </w:p>
+        </w:tc>
+        <w:tc>
+          <w:tcPr/>
+          <w:p>
+            <w:pPr>
+              <w:pStyle w:val="Compact"/>
+              <w:jc w:val="left"/>
+            </w:pPr>
+            <w:r>
+              <w:t xml:space="preserve">90%</w:t>
             </w:r>
           </w:p>
         </w:tc>
@@ -6155,31 +6149,51 @@
         <w:pStyle w:val="BodyText"/>
       </w:pPr>
       <w:r>
+        <w:t xml:space="preserve">By field, GROBID / PyMuPDF: baselines 97% / 99%, compute 92% / 97%, datasets 98% / 100%,</w:t>
+      </w:r>
+      <w:r>
+        <w:t xml:space="preserve"> </w:t>
+      </w:r>
+      <w:r>
+        <w:t xml:space="preserve">hyperparameters 67% / 81%, metrics 95% / 99%, task 98% / 98%.</w:t>
+      </w:r>
+    </w:p>
+    <w:p>
+      <w:pPr>
+        <w:pStyle w:val="BodyText"/>
+      </w:pPr>
+      <w:r>
         <w:t xml:space="preserve">GROBID gives the structure the rest of the pipeline relies on: section roles,</w:t>
       </w:r>
       <w:r>
         <w:t xml:space="preserve"> </w:t>
       </w:r>
       <w:r>
-        <w:t xml:space="preserve">references, in-text citations and equations. Raw PyMuPDF text keeps slightly more of the</w:t>
-      </w:r>
-      <w:r>
-        <w:t xml:space="preserve"> </w:t>
-      </w:r>
-      <w:r>
-        <w:t xml:space="preserve">gold values (hyperparameters: 85% vs 77%), mostly numbers in tables and footnotes that</w:t>
-      </w:r>
-      <w:r>
-        <w:t xml:space="preserve"> </w:t>
-      </w:r>
-      <w:r>
-        <w:t xml:space="preserve">GROBID drops. Gold values missing from the parse (11% with GROBID) put a ceiling on the</w:t>
-      </w:r>
-      <w:r>
-        <w:t xml:space="preserve"> </w:t>
-      </w:r>
-      <w:r>
-        <w:t xml:space="preserve">recall extraction can reach.</w:t>
+        <w:t xml:space="preserve">references, in-text citations and equations. Raw PyMuPDF text keeps more of the gold</w:t>
+      </w:r>
+      <w:r>
+        <w:t xml:space="preserve"> </w:t>
+      </w:r>
+      <w:r>
+        <w:t xml:space="preserve">values, mostly numbers in tables, footnotes and appendix lists that GROBID drops. A third</w:t>
+      </w:r>
+      <w:r>
+        <w:t xml:space="preserve"> </w:t>
+      </w:r>
+      <w:r>
+        <w:t xml:space="preserve">of the gold hyperparameter values never reach the extractor through GROBID’s text, so</w:t>
+      </w:r>
+      <w:r>
+        <w:t xml:space="preserve"> </w:t>
+      </w:r>
+      <w:r>
+        <w:t xml:space="preserve">67% is the ceiling for hyperparameter coverage; the run reaches 30%, less than half of</w:t>
+      </w:r>
+      <w:r>
+        <w:t xml:space="preserve"> </w:t>
+      </w:r>
+      <w:r>
+        <w:t xml:space="preserve">what the parse makes available.</w:t>
       </w:r>
     </w:p>
     <w:p>
@@ -6191,19 +6205,403 @@
           <w:bCs/>
           <w:b/>
         </w:rPr>
-        <w:t xml:space="preserve">A6: chat retrieval.</w:t>
-      </w:r>
-      <w:r>
-        <w:t xml:space="preserve"> </w:t>
-      </w:r>
-      <w:r>
-        <w:t xml:space="preserve">BM25 recall@5 is 47% on questions built from the gold set (task</w:t>
-      </w:r>
-      <w:r>
-        <w:t xml:space="preserve"> </w:t>
-      </w:r>
-      <w:r>
-        <w:t xml:space="preserve">58%, datasets 52%, baselines 30%, metrics 37%, hyperparameters 58%).</w:t>
+        <w:t xml:space="preserve">A6: chat retrieval</w:t>
+      </w:r>
+      <w:r>
+        <w:t xml:space="preserve"> </w:t>
+      </w:r>
+      <w:r>
+        <w:t xml:space="preserve">(recall@5 on 2,086 question-item pairs built from the gold set,</w:t>
+      </w:r>
+      <w:r>
+        <w:t xml:space="preserve"> </w:t>
+      </w:r>
+      <w:r>
+        <w:t xml:space="preserve">GROBID parse):</w:t>
+      </w:r>
+    </w:p>
+    <w:tbl>
+      <w:tblPr>
+        <w:tblStyle w:val="Table"/>
+        <w:tblW w:type="pct" w:w="5000"/>
+        <w:tblLook w:firstRow="1" w:lastRow="0" w:firstColumn="0" w:lastColumn="0" w:noHBand="0" w:noVBand="0" w:val="0020"/>
+        <w:jc w:val="start"/>
+      </w:tblPr>
+      <w:tblGrid>
+        <w:gridCol w:w="1131"/>
+        <w:gridCol w:w="1131"/>
+        <w:gridCol w:w="1131"/>
+        <w:gridCol w:w="1131"/>
+        <w:gridCol w:w="1131"/>
+        <w:gridCol w:w="1131"/>
+        <w:gridCol w:w="1131"/>
+      </w:tblGrid>
+      <w:tr>
+        <w:trPr>
+          <w:tblHeader w:val="true"/>
+        </w:trPr>
+        <w:tc>
+          <w:tcPr/>
+          <w:p>
+            <w:pPr>
+              <w:pStyle w:val="Compact"/>
+              <w:jc w:val="left"/>
+            </w:pPr>
+            <w:r>
+              <w:t xml:space="preserve">Retrieval</w:t>
+            </w:r>
+          </w:p>
+        </w:tc>
+        <w:tc>
+          <w:tcPr/>
+          <w:p>
+            <w:pPr>
+              <w:pStyle w:val="Compact"/>
+              <w:jc w:val="left"/>
+            </w:pPr>
+            <w:r>
+              <w:t xml:space="preserve">All</w:t>
+            </w:r>
+          </w:p>
+        </w:tc>
+        <w:tc>
+          <w:tcPr/>
+          <w:p>
+            <w:pPr>
+              <w:pStyle w:val="Compact"/>
+              <w:jc w:val="left"/>
+            </w:pPr>
+            <w:r>
+              <w:t xml:space="preserve">Task</w:t>
+            </w:r>
+          </w:p>
+        </w:tc>
+        <w:tc>
+          <w:tcPr/>
+          <w:p>
+            <w:pPr>
+              <w:pStyle w:val="Compact"/>
+              <w:jc w:val="left"/>
+            </w:pPr>
+            <w:r>
+              <w:t xml:space="preserve">Datasets</w:t>
+            </w:r>
+          </w:p>
+        </w:tc>
+        <w:tc>
+          <w:tcPr/>
+          <w:p>
+            <w:pPr>
+              <w:pStyle w:val="Compact"/>
+              <w:jc w:val="left"/>
+            </w:pPr>
+            <w:r>
+              <w:t xml:space="preserve">Baselines</w:t>
+            </w:r>
+          </w:p>
+        </w:tc>
+        <w:tc>
+          <w:tcPr/>
+          <w:p>
+            <w:pPr>
+              <w:pStyle w:val="Compact"/>
+              <w:jc w:val="left"/>
+            </w:pPr>
+            <w:r>
+              <w:t xml:space="preserve">Metrics</w:t>
+            </w:r>
+          </w:p>
+        </w:tc>
+        <w:tc>
+          <w:tcPr/>
+          <w:p>
+            <w:pPr>
+              <w:pStyle w:val="Compact"/>
+              <w:jc w:val="left"/>
+            </w:pPr>
+            <w:r>
+              <w:t xml:space="preserve">Hyperparameters</w:t>
+            </w:r>
+          </w:p>
+        </w:tc>
+      </w:tr>
+      <w:tr>
+        <w:tc>
+          <w:tcPr/>
+          <w:p>
+            <w:pPr>
+              <w:pStyle w:val="Compact"/>
+              <w:jc w:val="left"/>
+            </w:pPr>
+            <w:r>
+              <w:t xml:space="preserve">BM25</w:t>
+            </w:r>
+          </w:p>
+        </w:tc>
+        <w:tc>
+          <w:tcPr/>
+          <w:p>
+            <w:pPr>
+              <w:pStyle w:val="Compact"/>
+              <w:jc w:val="left"/>
+            </w:pPr>
+            <w:r>
+              <w:t xml:space="preserve">45%</w:t>
+            </w:r>
+          </w:p>
+        </w:tc>
+        <w:tc>
+          <w:tcPr/>
+          <w:p>
+            <w:pPr>
+              <w:pStyle w:val="Compact"/>
+              <w:jc w:val="left"/>
+            </w:pPr>
+            <w:r>
+              <w:t xml:space="preserve">53%</w:t>
+            </w:r>
+          </w:p>
+        </w:tc>
+        <w:tc>
+          <w:tcPr/>
+          <w:p>
+            <w:pPr>
+              <w:pStyle w:val="Compact"/>
+              <w:jc w:val="left"/>
+            </w:pPr>
+            <w:r>
+              <w:t xml:space="preserve">36%</w:t>
+            </w:r>
+          </w:p>
+        </w:tc>
+        <w:tc>
+          <w:tcPr/>
+          <w:p>
+            <w:pPr>
+              <w:pStyle w:val="Compact"/>
+              <w:jc w:val="left"/>
+            </w:pPr>
+            <w:r>
+              <w:t xml:space="preserve">41%</w:t>
+            </w:r>
+          </w:p>
+        </w:tc>
+        <w:tc>
+          <w:tcPr/>
+          <w:p>
+            <w:pPr>
+              <w:pStyle w:val="Compact"/>
+              <w:jc w:val="left"/>
+            </w:pPr>
+            <w:r>
+              <w:t xml:space="preserve">48%</w:t>
+            </w:r>
+          </w:p>
+        </w:tc>
+        <w:tc>
+          <w:tcPr/>
+          <w:p>
+            <w:pPr>
+              <w:pStyle w:val="Compact"/>
+              <w:jc w:val="left"/>
+            </w:pPr>
+            <w:r>
+              <w:t xml:space="preserve">50%</w:t>
+            </w:r>
+          </w:p>
+        </w:tc>
+      </w:tr>
+      <w:tr>
+        <w:tc>
+          <w:tcPr/>
+          <w:p>
+            <w:pPr>
+              <w:pStyle w:val="Compact"/>
+              <w:jc w:val="left"/>
+            </w:pPr>
+            <w:r>
+              <w:t xml:space="preserve">dense (bge-small)</w:t>
+            </w:r>
+          </w:p>
+        </w:tc>
+        <w:tc>
+          <w:tcPr/>
+          <w:p>
+            <w:pPr>
+              <w:pStyle w:val="Compact"/>
+              <w:jc w:val="left"/>
+            </w:pPr>
+            <w:r>
+              <w:t xml:space="preserve">36%</w:t>
+            </w:r>
+          </w:p>
+        </w:tc>
+        <w:tc>
+          <w:tcPr/>
+          <w:p>
+            <w:pPr>
+              <w:pStyle w:val="Compact"/>
+              <w:jc w:val="left"/>
+            </w:pPr>
+            <w:r>
+              <w:t xml:space="preserve">19%</w:t>
+            </w:r>
+          </w:p>
+        </w:tc>
+        <w:tc>
+          <w:tcPr/>
+          <w:p>
+            <w:pPr>
+              <w:pStyle w:val="Compact"/>
+              <w:jc w:val="left"/>
+            </w:pPr>
+            <w:r>
+              <w:t xml:space="preserve">37%</w:t>
+            </w:r>
+          </w:p>
+        </w:tc>
+        <w:tc>
+          <w:tcPr/>
+          <w:p>
+            <w:pPr>
+              <w:pStyle w:val="Compact"/>
+              <w:jc w:val="left"/>
+            </w:pPr>
+            <w:r>
+              <w:t xml:space="preserve">29%</w:t>
+            </w:r>
+          </w:p>
+        </w:tc>
+        <w:tc>
+          <w:tcPr/>
+          <w:p>
+            <w:pPr>
+              <w:pStyle w:val="Compact"/>
+              <w:jc w:val="left"/>
+            </w:pPr>
+            <w:r>
+              <w:t xml:space="preserve">46%</w:t>
+            </w:r>
+          </w:p>
+        </w:tc>
+        <w:tc>
+          <w:tcPr/>
+          <w:p>
+            <w:pPr>
+              <w:pStyle w:val="Compact"/>
+              <w:jc w:val="left"/>
+            </w:pPr>
+            <w:r>
+              <w:t xml:space="preserve">41%</w:t>
+            </w:r>
+          </w:p>
+        </w:tc>
+      </w:tr>
+      <w:tr>
+        <w:tc>
+          <w:tcPr/>
+          <w:p>
+            <w:pPr>
+              <w:pStyle w:val="Compact"/>
+              <w:jc w:val="left"/>
+            </w:pPr>
+            <w:r>
+              <w:t xml:space="preserve">hybrid (RRF)</w:t>
+            </w:r>
+          </w:p>
+        </w:tc>
+        <w:tc>
+          <w:tcPr/>
+          <w:p>
+            <w:pPr>
+              <w:pStyle w:val="Compact"/>
+              <w:jc w:val="left"/>
+            </w:pPr>
+            <w:r>
+              <w:t xml:space="preserve">45%</w:t>
+            </w:r>
+          </w:p>
+        </w:tc>
+        <w:tc>
+          <w:tcPr/>
+          <w:p>
+            <w:pPr>
+              <w:pStyle w:val="Compact"/>
+              <w:jc w:val="left"/>
+            </w:pPr>
+            <w:r>
+              <w:t xml:space="preserve">45%</w:t>
+            </w:r>
+          </w:p>
+        </w:tc>
+        <w:tc>
+          <w:tcPr/>
+          <w:p>
+            <w:pPr>
+              <w:pStyle w:val="Compact"/>
+              <w:jc w:val="left"/>
+            </w:pPr>
+            <w:r>
+              <w:t xml:space="preserve">40%</w:t>
+            </w:r>
+          </w:p>
+        </w:tc>
+        <w:tc>
+          <w:tcPr/>
+          <w:p>
+            <w:pPr>
+              <w:pStyle w:val="Compact"/>
+              <w:jc w:val="left"/>
+            </w:pPr>
+            <w:r>
+              <w:t xml:space="preserve">38%</w:t>
+            </w:r>
+          </w:p>
+        </w:tc>
+        <w:tc>
+          <w:tcPr/>
+          <w:p>
+            <w:pPr>
+              <w:pStyle w:val="Compact"/>
+              <w:jc w:val="left"/>
+            </w:pPr>
+            <w:r>
+              <w:t xml:space="preserve">49%</w:t>
+            </w:r>
+          </w:p>
+        </w:tc>
+        <w:tc>
+          <w:tcPr/>
+          <w:p>
+            <w:pPr>
+              <w:pStyle w:val="Compact"/>
+              <w:jc w:val="left"/>
+            </w:pPr>
+            <w:r>
+              <w:t xml:space="preserve">51%</w:t>
+            </w:r>
+          </w:p>
+        </w:tc>
+      </w:tr>
+    </w:tbl>
+    <w:p>
+      <w:pPr>
+        <w:pStyle w:val="BodyText"/>
+      </w:pPr>
+      <w:r>
+        <w:t xml:space="preserve">Dense retrieval alone is worse, above all on task questions; hybrid ties with BM25 overall</w:t>
+      </w:r>
+      <w:r>
+        <w:t xml:space="preserve"> </w:t>
+      </w:r>
+      <w:r>
+        <w:t xml:space="preserve">and helps on datasets, metrics and hyperparameters, which supports keeping BM25 in the</w:t>
+      </w:r>
+      <w:r>
+        <w:t xml:space="preserve"> </w:t>
+      </w:r>
+      <w:r>
+        <w:t xml:space="preserve">chat’s fusion.</w:t>
       </w:r>
     </w:p>
     <w:bookmarkEnd w:id="37"/>
@@ -6408,32 +6806,6 @@
             </w:pPr>
             <w:r>
               <w:t xml:space="preserve">extraction without asking for quotes at all</w:t>
-            </w:r>
-          </w:p>
-        </w:tc>
-      </w:tr>
-      <w:tr>
-        <w:tc>
-          <w:tcPr/>
-          <w:p>
-            <w:pPr>
-              <w:pStyle w:val="Compact"/>
-              <w:jc w:val="left"/>
-            </w:pPr>
-            <w:r>
-              <w:t xml:space="preserve">A6 dense / hybrid</w:t>
-            </w:r>
-          </w:p>
-        </w:tc>
-        <w:tc>
-          <w:tcPr/>
-          <w:p>
-            <w:pPr>
-              <w:pStyle w:val="Compact"/>
-              <w:jc w:val="left"/>
-            </w:pPr>
-            <w:r>
-              <w:t xml:space="preserve">needs the local embedding model downloaded</w:t>
             </w:r>
           </w:p>
         </w:tc>
@@ -7953,13 +8325,13 @@
         <w:t xml:space="preserve"> </w:t>
       </w:r>
       <w:r>
-        <w:t xml:space="preserve">On the reference papers, 11% of gold values are not present in the</w:t>
-      </w:r>
-      <w:r>
-        <w:t xml:space="preserve"> </w:t>
-      </w:r>
-      <w:r>
-        <w:t xml:space="preserve">GROBID text at all (A1), so no prompt change can recover them.</w:t>
+        <w:t xml:space="preserve">17% of gold values, and 33% of hyperparameter values, are not</w:t>
+      </w:r>
+      <w:r>
+        <w:t xml:space="preserve"> </w:t>
+      </w:r>
+      <w:r>
+        <w:t xml:space="preserve">present in the GROBID text at all (A1), so no prompt change can recover them.</w:t>
       </w:r>
     </w:p>
     <w:p>

</xml_diff>